<commit_message>
Fold in Zenodo DOI (10.5281/zenodo.22857631)
Repository pushed to GitHub and archived at Zenodo as release v1.0.0.
Verified the Zenodo record resolves with the correct title, three-
author list, and version before writing it into permanent citation
files.

- CITATION.cff: repository-code and identifiers.value filled in.
- README.md: DOI badge added; status line updated from the stale
  "DRAFT -- not yet author-verified" to reflect the 2026-09-20 sign-off
  and Zenodo archival.
- manuscript/build_manuscript.js: added an explicit data-and-code-
  availability statement at the top of Appendix A citing the DOI,
  distinguishing it from the base TPEC paper's own eventual DOI and
  from any future IEEE Xplore DOI. Rebuilt with --final and verified
  the DOI text renders correctly in the output PDF.

Co-Authored-By: Claude Sonnet 5 <noreply@anthropic.com>
Claude-Session: https://claude.ai/code/session_01STXEQUrz8Ura7T4i7Zm8NB
</commit_message>
<xml_diff>
--- a/manuscript/TII_extended_manuscript_v1.docx
+++ b/manuscript/TII_extended_manuscript_v1.docx
@@ -2792,6 +2792,24 @@
           <w:szCs w:val="24"/>
         </w:rPr>
         <w:t xml:space="preserve">Appendix A: Reproducibility</w:t>
+      </w:r>
+    </w:p>
+    <w:p>
+      <w:pPr>
+        <w:spacing w:after="160" w:line="360"/>
+        <w:jc w:val="both"/>
+      </w:pPr>
+      <w:r>
+        <w:rPr>
+          <w:rFonts w:ascii="Times New Roman" w:cs="Times New Roman" w:eastAsia="Times New Roman" w:hAnsi="Times New Roman"/>
+          <w:b w:val="false"/>
+          <w:bCs w:val="false"/>
+          <w:i/>
+          <w:iCs/>
+          <w:sz w:val="22"/>
+          <w:szCs w:val="22"/>
+        </w:rPr>
+        <w:t xml:space="preserve">Data and code availability: All new analysis code, configuration, documentation, figures, and this manuscript are archived at Zenodo, DOI: 10.5281/zenodo.22857631 (https://doi.org/10.5281/zenodo.22857631), corresponding to the GitHub repository release tagged v1.0.0. This DOI covers this extension's own reproducibility package; it is separate from any DOI the base TPEC 2027 paper's own reproducibility package may receive [1], and separate from the IEEE Xplore DOI this journal article would receive upon acceptance and publication.</w:t>
       </w:r>
     </w:p>
     <w:p>

</xml_diff>